<commit_message>
Update resume (may 2026) and update blog name
</commit_message>
<xml_diff>
--- a/public/resumes/piyush_datta_resume.docx
+++ b/public/resumes/piyush_datta_resume.docx
@@ -5,18 +5,6 @@
     <w:p>
       <w:pPr>
         <w:pStyle w:val="Title"/>
-      </w:pPr>
-      <w:r>
-        <w:t>Piyush Datta</w:t>
-      </w:r>
-    </w:p>
-    <w:p>
-      <w:pPr>
-        <w:spacing w:before="189"/>
-        <w:ind w:left="300"/>
-        <w:rPr>
-          <w:sz w:val="18"/>
-        </w:rPr>
         <w:sectPr>
           <w:type w:val="continuous"/>
           <w:pgSz w:w="12250" w:h="15880"/>
@@ -28,11 +16,16 @@
         </w:sectPr>
       </w:pPr>
       <w:r>
+        <w:t>Piyush Datt</w:t>
+      </w:r>
+      <w:r>
+        <w:t>a</w:t>
+      </w:r>
+      <w:r>
         <w:br w:type="column"/>
       </w:r>
       <w:r>
         <w:rPr>
-          <w:b/>
           <w:sz w:val="18"/>
         </w:rPr>
         <w:t xml:space="preserve">Website: </w:t>
@@ -51,26 +44,10 @@
           <w:color w:val="5F5F5F"/>
           <w:sz w:val="18"/>
         </w:rPr>
-        <w:t xml:space="preserve"> </w:t>
-      </w:r>
-      <w:r>
-        <w:rPr>
-          <w:color w:val="5F5F5F"/>
-          <w:w w:val="95"/>
-          <w:sz w:val="18"/>
-        </w:rPr>
-        <w:t>|</w:t>
-      </w:r>
-      <w:r>
-        <w:rPr>
-          <w:color w:val="5F5F5F"/>
-          <w:sz w:val="18"/>
-        </w:rPr>
         <w:t xml:space="preserve">       </w:t>
       </w:r>
       <w:r>
         <w:rPr>
-          <w:b/>
           <w:w w:val="95"/>
           <w:sz w:val="18"/>
         </w:rPr>
@@ -92,37 +69,10 @@
           <w:w w:val="95"/>
           <w:sz w:val="18"/>
         </w:rPr>
-        <w:t xml:space="preserve"> </w:t>
-      </w:r>
-      <w:r>
-        <w:rPr>
-          <w:color w:val="5F5F5F"/>
-          <w:w w:val="95"/>
-          <w:sz w:val="18"/>
-        </w:rPr>
-        <w:t xml:space="preserve">  </w:t>
-      </w:r>
-      <w:bookmarkStart w:id="0" w:name="_Hlk214835988"/>
-      <w:r>
-        <w:rPr>
-          <w:color w:val="5F5F5F"/>
-          <w:w w:val="95"/>
-          <w:sz w:val="18"/>
-        </w:rPr>
-        <w:t>|</w:t>
-      </w:r>
-      <w:bookmarkEnd w:id="0"/>
-      <w:r>
-        <w:rPr>
-          <w:color w:val="5F5F5F"/>
-          <w:w w:val="95"/>
-          <w:sz w:val="18"/>
-        </w:rPr>
         <w:t xml:space="preserve">         </w:t>
       </w:r>
       <w:r>
         <w:rPr>
-          <w:b/>
           <w:sz w:val="18"/>
         </w:rPr>
         <w:t xml:space="preserve">Email: </w:t>
@@ -137,21 +87,13 @@
         </w:r>
       </w:hyperlink>
       <w:r>
-        <w:t xml:space="preserve">          </w:t>
-      </w:r>
-      <w:r>
-        <w:rPr>
-          <w:color w:val="5F5F5F"/>
-          <w:w w:val="95"/>
-          <w:sz w:val="18"/>
-        </w:rPr>
-        <w:t>|</w:t>
+        <w:t xml:space="preserve">   </w:t>
       </w:r>
     </w:p>
     <w:p>
       <w:pPr>
         <w:pStyle w:val="BodyText"/>
-        <w:spacing w:before="7"/>
+        <w:spacing w:before="7" w:line="24" w:lineRule="auto"/>
         <w:ind w:left="0" w:firstLine="0"/>
         <w:rPr>
           <w:sz w:val="16"/>
@@ -168,41 +110,104 @@
       </w:pPr>
       <w:r>
         <w:rPr>
-          <w:sz w:val="20"/>
-        </w:rPr>
-      </w:r>
-      <w:r>
-        <w:rPr>
-          <w:sz w:val="20"/>
-        </w:rPr>
-        <w:pict w14:anchorId="6BEA5991">
-          <v:shapetype id="_x0000_t202" coordsize="21600,21600" o:spt="202" path="m,l,21600r21600,l21600,xe">
-            <v:stroke joinstyle="miter"/>
-            <v:path gradientshapeok="t" o:connecttype="rect"/>
-          </v:shapetype>
-          <v:shape id="_x0000_s1029" type="#_x0000_t202" alt="" style="width:568pt;height:18.4pt;mso-wrap-style:square;mso-width-percent:0;mso-height-percent:0;mso-left-percent:-10001;mso-top-percent:-10001;mso-position-horizontal:absolute;mso-position-horizontal-relative:char;mso-position-vertical:absolute;mso-position-vertical-relative:line;mso-width-percent:0;mso-height-percent:0;mso-left-percent:-10001;mso-top-percent:-10001;v-text-anchor:top" fillcolor="#ddd" strokecolor="#b1b1b1" strokeweight="1.44pt">
-            <v:textbox style="mso-next-textbox:#_x0000_s1029" inset="0,0,0,0">
-              <w:txbxContent>
-                <w:p>
-                  <w:pPr>
-                    <w:spacing w:before="19"/>
-                    <w:ind w:left="107"/>
-                    <w:rPr>
-                      <w:b/>
-                    </w:rPr>
-                  </w:pPr>
-                  <w:r>
-                    <w:rPr>
-                      <w:b/>
-                    </w:rPr>
-                    <w:t>Work Experience</w:t>
-                  </w:r>
-                </w:p>
-              </w:txbxContent>
-            </v:textbox>
-            <w10:anchorlock/>
-          </v:shape>
-        </w:pict>
+          <w:noProof/>
+          <w:sz w:val="20"/>
+        </w:rPr>
+        <mc:AlternateContent>
+          <mc:Choice Requires="wps">
+            <w:drawing>
+              <wp:inline distT="0" distB="0" distL="0" distR="0" wp14:anchorId="6BEA5991" wp14:editId="6931EFBB">
+                <wp:extent cx="7213600" cy="233680"/>
+                <wp:effectExtent l="13335" t="16510" r="12065" b="16510"/>
+                <wp:docPr id="26396829" name="Text Box 5"/>
+                <wp:cNvGraphicFramePr>
+                  <a:graphicFrameLocks xmlns:a="http://schemas.openxmlformats.org/drawingml/2006/main"/>
+                </wp:cNvGraphicFramePr>
+                <a:graphic xmlns:a="http://schemas.openxmlformats.org/drawingml/2006/main">
+                  <a:graphicData uri="http://schemas.microsoft.com/office/word/2010/wordprocessingShape">
+                    <wps:wsp>
+                      <wps:cNvSpPr txBox="1">
+                        <a:spLocks noChangeArrowheads="1"/>
+                      </wps:cNvSpPr>
+                      <wps:spPr bwMode="auto">
+                        <a:xfrm>
+                          <a:off x="0" y="0"/>
+                          <a:ext cx="7213600" cy="233680"/>
+                        </a:xfrm>
+                        <a:prstGeom prst="rect">
+                          <a:avLst/>
+                        </a:prstGeom>
+                        <a:solidFill>
+                          <a:srgbClr val="DDDDDD"/>
+                        </a:solidFill>
+                        <a:ln w="18288">
+                          <a:solidFill>
+                            <a:srgbClr val="B1B1B1"/>
+                          </a:solidFill>
+                          <a:miter lim="800000"/>
+                          <a:headEnd/>
+                          <a:tailEnd/>
+                        </a:ln>
+                      </wps:spPr>
+                      <wps:txbx>
+                        <w:txbxContent>
+                          <w:p>
+                            <w:pPr>
+                              <w:spacing w:before="19"/>
+                              <w:ind w:left="107"/>
+                              <w:rPr>
+                                <w:b/>
+                              </w:rPr>
+                            </w:pPr>
+                            <w:r>
+                              <w:rPr>
+                                <w:b/>
+                              </w:rPr>
+                              <w:t>Work Experience</w:t>
+                            </w:r>
+                          </w:p>
+                        </w:txbxContent>
+                      </wps:txbx>
+                      <wps:bodyPr rot="0" vert="horz" wrap="square" lIns="0" tIns="0" rIns="0" bIns="0" anchor="t" anchorCtr="0" upright="1">
+                        <a:noAutofit/>
+                      </wps:bodyPr>
+                    </wps:wsp>
+                  </a:graphicData>
+                </a:graphic>
+              </wp:inline>
+            </w:drawing>
+          </mc:Choice>
+          <mc:Fallback>
+            <w:pict>
+              <v:shapetype w14:anchorId="6BEA5991" id="_x0000_t202" coordsize="21600,21600" o:spt="202" path="m,l,21600r21600,l21600,xe">
+                <v:stroke joinstyle="miter"/>
+                <v:path gradientshapeok="t" o:connecttype="rect"/>
+              </v:shapetype>
+              <v:shape id="Text Box 5" o:spid="_x0000_s1026" type="#_x0000_t202" style="width:568pt;height:18.4pt;visibility:visible;mso-wrap-style:square;mso-left-percent:-10001;mso-top-percent:-10001;mso-position-horizontal:absolute;mso-position-horizontal-relative:char;mso-position-vertical:absolute;mso-position-vertical-relative:line;mso-left-percent:-10001;mso-top-percent:-10001;v-text-anchor:top" o:gfxdata="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" fillcolor="#ddd" strokecolor="#b1b1b1" strokeweight="1.44pt">
+                <v:textbox inset="0,0,0,0">
+                  <w:txbxContent>
+                    <w:p>
+                      <w:pPr>
+                        <w:spacing w:before="19"/>
+                        <w:ind w:left="107"/>
+                        <w:rPr>
+                          <w:b/>
+                        </w:rPr>
+                      </w:pPr>
+                      <w:r>
+                        <w:rPr>
+                          <w:b/>
+                        </w:rPr>
+                        <w:t>Work Experience</w:t>
+                      </w:r>
+                    </w:p>
+                  </w:txbxContent>
+                </v:textbox>
+                <w10:anchorlock/>
+              </v:shape>
+            </w:pict>
+          </mc:Fallback>
+        </mc:AlternateContent>
       </w:r>
     </w:p>
     <w:p>
@@ -396,20 +401,7 @@
         <w:rPr>
           <w:sz w:val="20"/>
         </w:rPr>
-        <w:t>Core engineer on Meta Ads Infrastructure, developing low</w:t>
-      </w:r>
-      <w:r>
-        <w:rPr>
-          <w:rFonts w:ascii="Cambria Math" w:hAnsi="Cambria Math" w:cs="Cambria Math"/>
-          <w:sz w:val="20"/>
-        </w:rPr>
-        <w:t>‑</w:t>
-      </w:r>
-      <w:r>
-        <w:rPr>
-          <w:sz w:val="20"/>
-        </w:rPr>
-        <w:t>latency C/C++ services powering global ad delivery.</w:t>
+        <w:t>Recruited from Ads Infrastructure to a high-priority AI team after delivering high-impact ML infrastructure work.</w:t>
       </w:r>
     </w:p>
     <w:p>
@@ -436,207 +428,6 @@
     </w:p>
     <w:p>
       <w:pPr>
-        <w:tabs>
-          <w:tab w:val="left" w:pos="946"/>
-          <w:tab w:val="left" w:pos="947"/>
-        </w:tabs>
-        <w:rPr>
-          <w:sz w:val="20"/>
-        </w:rPr>
-      </w:pPr>
-    </w:p>
-    <w:p>
-      <w:pPr>
-        <w:tabs>
-          <w:tab w:val="left" w:pos="10047"/>
-        </w:tabs>
-        <w:spacing w:line="275" w:lineRule="exact"/>
-        <w:ind w:left="226"/>
-        <w:rPr>
-          <w:sz w:val="20"/>
-          <w:szCs w:val="20"/>
-        </w:rPr>
-      </w:pPr>
-      <w:r>
-        <w:rPr>
-          <w:b/>
-          <w:sz w:val="20"/>
-          <w:szCs w:val="20"/>
-        </w:rPr>
-        <w:t>Amazon Web</w:t>
-      </w:r>
-      <w:r>
-        <w:rPr>
-          <w:b/>
-          <w:spacing w:val="-4"/>
-          <w:sz w:val="20"/>
-          <w:szCs w:val="20"/>
-        </w:rPr>
-        <w:t xml:space="preserve"> </w:t>
-      </w:r>
-      <w:r>
-        <w:rPr>
-          <w:b/>
-          <w:sz w:val="20"/>
-          <w:szCs w:val="20"/>
-        </w:rPr>
-        <w:t>Services</w:t>
-      </w:r>
-      <w:r>
-        <w:rPr>
-          <w:b/>
-          <w:sz w:val="20"/>
-          <w:szCs w:val="20"/>
-        </w:rPr>
-        <w:t xml:space="preserve">                                                                                                                        </w:t>
-      </w:r>
-      <w:r>
-        <w:rPr>
-          <w:b/>
-          <w:sz w:val="20"/>
-          <w:szCs w:val="20"/>
-        </w:rPr>
-        <w:t xml:space="preserve">       </w:t>
-      </w:r>
-      <w:r>
-        <w:rPr>
-          <w:sz w:val="20"/>
-          <w:szCs w:val="20"/>
-        </w:rPr>
-        <w:t>San Francisco Bay Area</w:t>
-      </w:r>
-      <w:r>
-        <w:rPr>
-          <w:sz w:val="20"/>
-          <w:szCs w:val="20"/>
-        </w:rPr>
-        <w:t>,</w:t>
-      </w:r>
-      <w:r>
-        <w:rPr>
-          <w:spacing w:val="-18"/>
-          <w:sz w:val="20"/>
-          <w:szCs w:val="20"/>
-        </w:rPr>
-        <w:t xml:space="preserve"> </w:t>
-      </w:r>
-      <w:r>
-        <w:rPr>
-          <w:sz w:val="20"/>
-          <w:szCs w:val="20"/>
-        </w:rPr>
-        <w:t>CA</w:t>
-      </w:r>
-    </w:p>
-    <w:p>
-      <w:pPr>
-        <w:tabs>
-          <w:tab w:val="left" w:pos="9269"/>
-        </w:tabs>
-        <w:spacing w:line="299" w:lineRule="exact"/>
-        <w:rPr>
-          <w:sz w:val="20"/>
-          <w:szCs w:val="20"/>
-        </w:rPr>
-      </w:pPr>
-      <w:r>
-        <w:rPr>
-          <w:i/>
-          <w:sz w:val="20"/>
-          <w:szCs w:val="20"/>
-        </w:rPr>
-        <w:t xml:space="preserve">    </w:t>
-      </w:r>
-      <w:r>
-        <w:rPr>
-          <w:i/>
-          <w:sz w:val="20"/>
-          <w:szCs w:val="20"/>
-        </w:rPr>
-        <w:t>Software</w:t>
-      </w:r>
-      <w:r>
-        <w:rPr>
-          <w:i/>
-          <w:spacing w:val="-13"/>
-          <w:sz w:val="20"/>
-          <w:szCs w:val="20"/>
-        </w:rPr>
-        <w:t xml:space="preserve"> </w:t>
-      </w:r>
-      <w:r>
-        <w:rPr>
-          <w:i/>
-          <w:sz w:val="20"/>
-          <w:szCs w:val="20"/>
-        </w:rPr>
-        <w:t>Enginee</w:t>
-      </w:r>
-      <w:r>
-        <w:rPr>
-          <w:i/>
-          <w:sz w:val="20"/>
-          <w:szCs w:val="20"/>
-        </w:rPr>
-        <w:t>r</w:t>
-      </w:r>
-      <w:r>
-        <w:rPr>
-          <w:i/>
-          <w:sz w:val="20"/>
-          <w:szCs w:val="20"/>
-        </w:rPr>
-        <w:tab/>
-      </w:r>
-      <w:r>
-        <w:rPr>
-          <w:i/>
-          <w:sz w:val="20"/>
-          <w:szCs w:val="20"/>
-        </w:rPr>
-        <w:t xml:space="preserve"> </w:t>
-      </w:r>
-      <w:r>
-        <w:rPr>
-          <w:i/>
-          <w:sz w:val="20"/>
-          <w:szCs w:val="20"/>
-        </w:rPr>
-        <w:tab/>
-      </w:r>
-      <w:r>
-        <w:rPr>
-          <w:i/>
-          <w:sz w:val="20"/>
-          <w:szCs w:val="20"/>
-        </w:rPr>
-        <w:tab/>
-        <w:t xml:space="preserve">       </w:t>
-      </w:r>
-      <w:r>
-        <w:rPr>
-          <w:sz w:val="20"/>
-          <w:szCs w:val="20"/>
-        </w:rPr>
-        <w:t xml:space="preserve">2020 </w:t>
-      </w:r>
-      <w:r>
-        <w:rPr>
-          <w:sz w:val="20"/>
-          <w:szCs w:val="20"/>
-        </w:rPr>
-        <w:t xml:space="preserve">– </w:t>
-      </w:r>
-      <w:r>
-        <w:rPr>
-          <w:sz w:val="20"/>
-          <w:szCs w:val="20"/>
-        </w:rPr>
-        <w:t>2025</w:t>
-      </w:r>
-    </w:p>
-    <w:p>
-      <w:pPr>
         <w:pStyle w:val="ListParagraph"/>
         <w:numPr>
           <w:ilvl w:val="0"/>
@@ -648,15 +439,220 @@
         </w:tabs>
         <w:rPr>
           <w:sz w:val="20"/>
-          <w:szCs w:val="20"/>
-        </w:rPr>
-      </w:pPr>
-      <w:r>
-        <w:rPr>
-          <w:sz w:val="20"/>
-          <w:szCs w:val="20"/>
-        </w:rPr>
-        <w:t>Database kernel (MySQL/Postgres) engineer on the AWS Aurora Database Engine team using C/C++.</w:t>
+        </w:rPr>
+      </w:pPr>
+      <w:r>
+        <w:rPr>
+          <w:sz w:val="20"/>
+        </w:rPr>
+        <w:t>Built infrastructure for a generalized ad-ranking model that improved ad value by 1–2% per ranked ad</w:t>
+      </w:r>
+      <w:r>
+        <w:rPr>
+          <w:sz w:val="20"/>
+        </w:rPr>
+        <w:t>.</w:t>
+      </w:r>
+    </w:p>
+    <w:p>
+      <w:pPr>
+        <w:tabs>
+          <w:tab w:val="left" w:pos="946"/>
+          <w:tab w:val="left" w:pos="947"/>
+        </w:tabs>
+        <w:rPr>
+          <w:sz w:val="20"/>
+        </w:rPr>
+      </w:pPr>
+    </w:p>
+    <w:p>
+      <w:pPr>
+        <w:tabs>
+          <w:tab w:val="left" w:pos="10047"/>
+        </w:tabs>
+        <w:spacing w:line="275" w:lineRule="exact"/>
+        <w:ind w:left="226"/>
+        <w:rPr>
+          <w:sz w:val="20"/>
+          <w:szCs w:val="20"/>
+        </w:rPr>
+      </w:pPr>
+      <w:r>
+        <w:rPr>
+          <w:b/>
+          <w:sz w:val="20"/>
+          <w:szCs w:val="20"/>
+        </w:rPr>
+        <w:t>Amazon Web</w:t>
+      </w:r>
+      <w:r>
+        <w:rPr>
+          <w:b/>
+          <w:spacing w:val="-4"/>
+          <w:sz w:val="20"/>
+          <w:szCs w:val="20"/>
+        </w:rPr>
+        <w:t xml:space="preserve"> </w:t>
+      </w:r>
+      <w:r>
+        <w:rPr>
+          <w:b/>
+          <w:sz w:val="20"/>
+          <w:szCs w:val="20"/>
+        </w:rPr>
+        <w:t>Services</w:t>
+      </w:r>
+      <w:r>
+        <w:rPr>
+          <w:b/>
+          <w:sz w:val="20"/>
+          <w:szCs w:val="20"/>
+        </w:rPr>
+        <w:t xml:space="preserve">                                                                                                                        </w:t>
+      </w:r>
+      <w:r>
+        <w:rPr>
+          <w:b/>
+          <w:sz w:val="20"/>
+          <w:szCs w:val="20"/>
+        </w:rPr>
+        <w:t xml:space="preserve">       </w:t>
+      </w:r>
+      <w:r>
+        <w:rPr>
+          <w:sz w:val="20"/>
+          <w:szCs w:val="20"/>
+        </w:rPr>
+        <w:t>San Francisco Bay Area</w:t>
+      </w:r>
+      <w:r>
+        <w:rPr>
+          <w:sz w:val="20"/>
+          <w:szCs w:val="20"/>
+        </w:rPr>
+        <w:t>,</w:t>
+      </w:r>
+      <w:r>
+        <w:rPr>
+          <w:spacing w:val="-18"/>
+          <w:sz w:val="20"/>
+          <w:szCs w:val="20"/>
+        </w:rPr>
+        <w:t xml:space="preserve"> </w:t>
+      </w:r>
+      <w:r>
+        <w:rPr>
+          <w:sz w:val="20"/>
+          <w:szCs w:val="20"/>
+        </w:rPr>
+        <w:t>CA</w:t>
+      </w:r>
+    </w:p>
+    <w:p>
+      <w:pPr>
+        <w:tabs>
+          <w:tab w:val="left" w:pos="9269"/>
+        </w:tabs>
+        <w:spacing w:line="299" w:lineRule="exact"/>
+        <w:rPr>
+          <w:sz w:val="20"/>
+          <w:szCs w:val="20"/>
+        </w:rPr>
+      </w:pPr>
+      <w:r>
+        <w:rPr>
+          <w:i/>
+          <w:sz w:val="20"/>
+          <w:szCs w:val="20"/>
+        </w:rPr>
+        <w:t xml:space="preserve">    </w:t>
+      </w:r>
+      <w:r>
+        <w:rPr>
+          <w:i/>
+          <w:sz w:val="20"/>
+          <w:szCs w:val="20"/>
+        </w:rPr>
+        <w:t>Software</w:t>
+      </w:r>
+      <w:r>
+        <w:rPr>
+          <w:i/>
+          <w:spacing w:val="-13"/>
+          <w:sz w:val="20"/>
+          <w:szCs w:val="20"/>
+        </w:rPr>
+        <w:t xml:space="preserve"> </w:t>
+      </w:r>
+      <w:r>
+        <w:rPr>
+          <w:i/>
+          <w:sz w:val="20"/>
+          <w:szCs w:val="20"/>
+        </w:rPr>
+        <w:t>Enginee</w:t>
+      </w:r>
+      <w:r>
+        <w:rPr>
+          <w:i/>
+          <w:sz w:val="20"/>
+          <w:szCs w:val="20"/>
+        </w:rPr>
+        <w:t>r</w:t>
+      </w:r>
+      <w:r>
+        <w:rPr>
+          <w:i/>
+          <w:sz w:val="20"/>
+          <w:szCs w:val="20"/>
+        </w:rPr>
+        <w:tab/>
+      </w:r>
+      <w:r>
+        <w:rPr>
+          <w:i/>
+          <w:sz w:val="20"/>
+          <w:szCs w:val="20"/>
+        </w:rPr>
+        <w:t xml:space="preserve"> </w:t>
+      </w:r>
+      <w:r>
+        <w:rPr>
+          <w:i/>
+          <w:sz w:val="20"/>
+          <w:szCs w:val="20"/>
+        </w:rPr>
+        <w:tab/>
+      </w:r>
+      <w:r>
+        <w:rPr>
+          <w:i/>
+          <w:sz w:val="20"/>
+          <w:szCs w:val="20"/>
+        </w:rPr>
+        <w:tab/>
+        <w:t xml:space="preserve">       </w:t>
+      </w:r>
+      <w:r>
+        <w:rPr>
+          <w:sz w:val="20"/>
+          <w:szCs w:val="20"/>
+        </w:rPr>
+        <w:t xml:space="preserve">2020 </w:t>
+      </w:r>
+      <w:r>
+        <w:rPr>
+          <w:sz w:val="20"/>
+          <w:szCs w:val="20"/>
+        </w:rPr>
+        <w:t xml:space="preserve">– </w:t>
+      </w:r>
+      <w:r>
+        <w:rPr>
+          <w:sz w:val="20"/>
+          <w:szCs w:val="20"/>
+        </w:rPr>
+        <w:t>2025</w:t>
       </w:r>
     </w:p>
     <w:p>
@@ -680,6 +676,44 @@
           <w:sz w:val="20"/>
           <w:szCs w:val="20"/>
         </w:rPr>
+        <w:t>Database kernel (MySQL/</w:t>
+      </w:r>
+      <w:r>
+        <w:rPr>
+          <w:sz w:val="20"/>
+          <w:szCs w:val="20"/>
+        </w:rPr>
+        <w:t>PostgreSQL</w:t>
+      </w:r>
+      <w:r>
+        <w:rPr>
+          <w:sz w:val="20"/>
+          <w:szCs w:val="20"/>
+        </w:rPr>
+        <w:t>) engineer on the AWS Aurora Database Engine team using C/C++.</w:t>
+      </w:r>
+    </w:p>
+    <w:p>
+      <w:pPr>
+        <w:pStyle w:val="ListParagraph"/>
+        <w:numPr>
+          <w:ilvl w:val="0"/>
+          <w:numId w:val="1"/>
+        </w:numPr>
+        <w:tabs>
+          <w:tab w:val="left" w:pos="946"/>
+          <w:tab w:val="left" w:pos="947"/>
+        </w:tabs>
+        <w:rPr>
+          <w:sz w:val="20"/>
+          <w:szCs w:val="20"/>
+        </w:rPr>
+      </w:pPr>
+      <w:r>
+        <w:rPr>
+          <w:sz w:val="20"/>
+          <w:szCs w:val="20"/>
+        </w:rPr>
         <w:t xml:space="preserve">Core engineer on the new </w:t>
       </w:r>
       <w:r>
@@ -696,17 +730,8 @@
           <w:sz w:val="20"/>
           <w:szCs w:val="20"/>
         </w:rPr>
-        <w:t xml:space="preserve"> product, presented at 2024 </w:t>
-      </w:r>
-      <w:proofErr w:type="spellStart"/>
-      <w:r>
-        <w:rPr>
-          <w:sz w:val="20"/>
-          <w:szCs w:val="20"/>
-        </w:rPr>
-        <w:t>re:Invent</w:t>
-      </w:r>
-      <w:proofErr w:type="spellEnd"/>
+        <w:t xml:space="preserve"> product, presented at 2024 re:Invent</w:t>
+      </w:r>
       <w:r>
         <w:rPr>
           <w:sz w:val="20"/>
@@ -821,7 +846,6 @@
           <w:szCs w:val="20"/>
         </w:rPr>
       </w:pPr>
-      <w:proofErr w:type="spellStart"/>
       <w:r>
         <w:rPr>
           <w:b/>
@@ -830,7 +854,6 @@
         </w:rPr>
         <w:t>Givex</w:t>
       </w:r>
-      <w:proofErr w:type="spellEnd"/>
       <w:r>
         <w:rPr>
           <w:b/>
@@ -998,83 +1021,163 @@
         </w:tabs>
         <w:spacing w:line="299" w:lineRule="exact"/>
         <w:rPr>
-          <w:sz w:val="20"/>
-          <w:szCs w:val="20"/>
-        </w:rPr>
-      </w:pPr>
-      <w:r>
-        <w:rPr>
-          <w:sz w:val="20"/>
-          <w:szCs w:val="20"/>
-        </w:rPr>
-        <w:t>Backend development using Python, JavaScript, C/C++, PostgreSQL, and Unix.</w:t>
-      </w:r>
-    </w:p>
-    <w:p>
-      <w:pPr>
-        <w:pStyle w:val="ListParagraph"/>
-        <w:numPr>
-          <w:ilvl w:val="0"/>
-          <w:numId w:val="1"/>
-        </w:numPr>
+          <w:sz w:val="19"/>
+        </w:rPr>
+      </w:pPr>
+      <w:r>
+        <w:rPr>
+          <w:sz w:val="20"/>
+          <w:szCs w:val="20"/>
+        </w:rPr>
+        <w:t xml:space="preserve">Implemented POS and </w:t>
+      </w:r>
+      <w:r>
+        <w:rPr>
+          <w:sz w:val="20"/>
+          <w:szCs w:val="20"/>
+        </w:rPr>
+        <w:t xml:space="preserve">transaction-based solutions </w:t>
+      </w:r>
+      <w:r>
+        <w:rPr>
+          <w:sz w:val="20"/>
+          <w:szCs w:val="20"/>
+        </w:rPr>
+        <w:t>using Python, JavaScript, C/C++, PostgreSQL, and Unix.</w:t>
+      </w:r>
+    </w:p>
+    <w:p>
+      <w:pPr>
         <w:tabs>
           <w:tab w:val="left" w:pos="946"/>
           <w:tab w:val="left" w:pos="947"/>
         </w:tabs>
         <w:spacing w:line="299" w:lineRule="exact"/>
         <w:rPr>
-          <w:sz w:val="20"/>
-          <w:szCs w:val="20"/>
-        </w:rPr>
-      </w:pPr>
-      <w:r>
-        <w:rPr>
-          <w:sz w:val="20"/>
-          <w:szCs w:val="20"/>
-        </w:rPr>
-        <w:t>Implemented gift card, point-of-sale, and other transaction-based solutions for Fortune 500 companies.</w:t>
-      </w:r>
-    </w:p>
-    <w:p>
-      <w:pPr>
-        <w:pStyle w:val="BodyText"/>
-        <w:spacing w:before="5"/>
-        <w:ind w:left="0" w:firstLine="0"/>
-        <w:rPr>
           <w:sz w:val="19"/>
         </w:rPr>
       </w:pPr>
       <w:r>
-        <w:pict w14:anchorId="187AF282">
-          <v:shape id="_x0000_s1028" type="#_x0000_t202" alt="" style="position:absolute;margin-left:22.2pt;margin-top:15.9pt;width:568pt;height:18.4pt;z-index:-15728128;mso-wrap-style:square;mso-wrap-edited:f;mso-width-percent:0;mso-height-percent:0;mso-wrap-distance-left:0;mso-wrap-distance-right:0;mso-position-horizontal-relative:page;mso-width-percent:0;mso-height-percent:0;v-text-anchor:top" fillcolor="#ddd" strokecolor="#b1b1b1" strokeweight="1.44pt">
-            <v:textbox style="mso-next-textbox:#_x0000_s1028" inset="0,0,0,0">
-              <w:txbxContent>
-                <w:p>
-                  <w:pPr>
-                    <w:spacing w:before="19"/>
-                    <w:ind w:left="107"/>
-                    <w:rPr>
-                      <w:b/>
-                    </w:rPr>
-                  </w:pPr>
-                  <w:r>
-                    <w:rPr>
-                      <w:b/>
-                    </w:rPr>
-                    <w:t xml:space="preserve">Contributions &amp; </w:t>
-                  </w:r>
-                  <w:r>
-                    <w:rPr>
-                      <w:b/>
-                    </w:rPr>
-                    <w:t>Projects</w:t>
-                  </w:r>
-                </w:p>
-              </w:txbxContent>
-            </v:textbox>
-            <w10:wrap type="topAndBottom" anchorx="page"/>
-          </v:shape>
-        </w:pict>
+        <w:rPr>
+          <w:noProof/>
+        </w:rPr>
+        <mc:AlternateContent>
+          <mc:Choice Requires="wps">
+            <w:drawing>
+              <wp:anchor distT="0" distB="0" distL="0" distR="0" simplePos="0" relativeHeight="487588352" behindDoc="1" locked="0" layoutInCell="1" allowOverlap="1" wp14:anchorId="187AF282" wp14:editId="1F46140D">
+                <wp:simplePos x="0" y="0"/>
+                <wp:positionH relativeFrom="page">
+                  <wp:posOffset>281940</wp:posOffset>
+                </wp:positionH>
+                <wp:positionV relativeFrom="paragraph">
+                  <wp:posOffset>201930</wp:posOffset>
+                </wp:positionV>
+                <wp:extent cx="7213600" cy="233680"/>
+                <wp:effectExtent l="0" t="0" r="0" b="0"/>
+                <wp:wrapTopAndBottom/>
+                <wp:docPr id="633622915" name="Text Box 4"/>
+                <wp:cNvGraphicFramePr>
+                  <a:graphicFrameLocks xmlns:a="http://schemas.openxmlformats.org/drawingml/2006/main"/>
+                </wp:cNvGraphicFramePr>
+                <a:graphic xmlns:a="http://schemas.openxmlformats.org/drawingml/2006/main">
+                  <a:graphicData uri="http://schemas.microsoft.com/office/word/2010/wordprocessingShape">
+                    <wps:wsp>
+                      <wps:cNvSpPr txBox="1">
+                        <a:spLocks noChangeArrowheads="1"/>
+                      </wps:cNvSpPr>
+                      <wps:spPr bwMode="auto">
+                        <a:xfrm>
+                          <a:off x="0" y="0"/>
+                          <a:ext cx="7213600" cy="233680"/>
+                        </a:xfrm>
+                        <a:prstGeom prst="rect">
+                          <a:avLst/>
+                        </a:prstGeom>
+                        <a:solidFill>
+                          <a:srgbClr val="DDDDDD"/>
+                        </a:solidFill>
+                        <a:ln w="18288">
+                          <a:solidFill>
+                            <a:srgbClr val="B1B1B1"/>
+                          </a:solidFill>
+                          <a:miter lim="800000"/>
+                          <a:headEnd/>
+                          <a:tailEnd/>
+                        </a:ln>
+                      </wps:spPr>
+                      <wps:txbx>
+                        <w:txbxContent>
+                          <w:p>
+                            <w:pPr>
+                              <w:spacing w:before="19"/>
+                              <w:ind w:left="107"/>
+                              <w:rPr>
+                                <w:b/>
+                              </w:rPr>
+                            </w:pPr>
+                            <w:r>
+                              <w:rPr>
+                                <w:b/>
+                              </w:rPr>
+                              <w:t xml:space="preserve">Contributions &amp; </w:t>
+                            </w:r>
+                            <w:r>
+                              <w:rPr>
+                                <w:b/>
+                              </w:rPr>
+                              <w:t>Projects</w:t>
+                            </w:r>
+                          </w:p>
+                        </w:txbxContent>
+                      </wps:txbx>
+                      <wps:bodyPr rot="0" vert="horz" wrap="square" lIns="0" tIns="0" rIns="0" bIns="0" anchor="t" anchorCtr="0" upright="1">
+                        <a:noAutofit/>
+                      </wps:bodyPr>
+                    </wps:wsp>
+                  </a:graphicData>
+                </a:graphic>
+                <wp14:sizeRelH relativeFrom="page">
+                  <wp14:pctWidth>0</wp14:pctWidth>
+                </wp14:sizeRelH>
+                <wp14:sizeRelV relativeFrom="page">
+                  <wp14:pctHeight>0</wp14:pctHeight>
+                </wp14:sizeRelV>
+              </wp:anchor>
+            </w:drawing>
+          </mc:Choice>
+          <mc:Fallback>
+            <w:pict>
+              <v:shape w14:anchorId="187AF282" id="Text Box 4" o:spid="_x0000_s1027" type="#_x0000_t202" style="position:absolute;margin-left:22.2pt;margin-top:15.9pt;width:568pt;height:18.4pt;z-index:-15728128;visibility:visible;mso-wrap-style:square;mso-width-percent:0;mso-height-percent:0;mso-wrap-distance-left:0;mso-wrap-distance-top:0;mso-wrap-distance-right:0;mso-wrap-distance-bottom:0;mso-position-horizontal:absolute;mso-position-horizontal-relative:page;mso-position-vertical:absolute;mso-position-vertical-relative:text;mso-width-percent:0;mso-height-percent:0;mso-width-relative:page;mso-height-relative:page;v-text-anchor:top" o:gfxdata="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" fillcolor="#ddd" strokecolor="#b1b1b1" strokeweight="1.44pt">
+                <v:textbox inset="0,0,0,0">
+                  <w:txbxContent>
+                    <w:p>
+                      <w:pPr>
+                        <w:spacing w:before="19"/>
+                        <w:ind w:left="107"/>
+                        <w:rPr>
+                          <w:b/>
+                        </w:rPr>
+                      </w:pPr>
+                      <w:r>
+                        <w:rPr>
+                          <w:b/>
+                        </w:rPr>
+                        <w:t xml:space="preserve">Contributions &amp; </w:t>
+                      </w:r>
+                      <w:r>
+                        <w:rPr>
+                          <w:b/>
+                        </w:rPr>
+                        <w:t>Projects</w:t>
+                      </w:r>
+                    </w:p>
+                  </w:txbxContent>
+                </v:textbox>
+                <w10:wrap type="topAndBottom" anchorx="page"/>
+              </v:shape>
+            </w:pict>
+          </mc:Fallback>
+        </mc:AlternateContent>
       </w:r>
     </w:p>
     <w:p>
@@ -1236,7 +1339,7 @@
           <w:sz w:val="20"/>
           <w:szCs w:val="20"/>
         </w:rPr>
-        <w:t>Created a fully functional cross-platform app that acts as an AI assistant for youth facing homelessness.</w:t>
+        <w:t>Created a fully functional cross-platform app that serves as an AI assistant for youth facing homelessness.</w:t>
       </w:r>
     </w:p>
     <w:p>
@@ -1256,53 +1359,27 @@
           <w:sz w:val="20"/>
           <w:szCs w:val="20"/>
         </w:rPr>
-        <w:t xml:space="preserve">Enabled users to chat with the AI assistant via </w:t>
-      </w:r>
-      <w:r>
-        <w:rPr>
-          <w:sz w:val="20"/>
-          <w:szCs w:val="20"/>
-        </w:rPr>
-        <w:t>text or speech</w:t>
-      </w:r>
-      <w:r>
-        <w:rPr>
-          <w:sz w:val="20"/>
-          <w:szCs w:val="20"/>
-        </w:rPr>
-        <w:t>; the assistant could also place phone calls to agencies on the user’s behalf</w:t>
-      </w:r>
-      <w:r>
-        <w:rPr>
-          <w:sz w:val="20"/>
-          <w:szCs w:val="20"/>
-        </w:rPr>
-        <w:t xml:space="preserve"> without using </w:t>
-      </w:r>
-      <w:r>
-        <w:rPr>
-          <w:sz w:val="20"/>
-          <w:szCs w:val="20"/>
-        </w:rPr>
-        <w:t xml:space="preserve">the </w:t>
-      </w:r>
-      <w:r>
-        <w:rPr>
-          <w:sz w:val="20"/>
-          <w:szCs w:val="20"/>
-        </w:rPr>
-        <w:t>user’s phone number</w:t>
-      </w:r>
-      <w:r>
-        <w:rPr>
-          <w:sz w:val="20"/>
-          <w:szCs w:val="20"/>
-        </w:rPr>
-        <w:t>.</w:t>
-      </w:r>
-    </w:p>
-    <w:p>
-      <w:pPr>
+        <w:t>Enable</w:t>
+      </w:r>
+      <w:r>
+        <w:rPr>
+          <w:sz w:val="20"/>
+          <w:szCs w:val="20"/>
+        </w:rPr>
+        <w:t>d</w:t>
+      </w:r>
+      <w:r>
+        <w:rPr>
+          <w:sz w:val="20"/>
+          <w:szCs w:val="20"/>
+        </w:rPr>
+        <w:t xml:space="preserve"> users to chat with the assistant via text or speech and place phone calls to agencies without exposing the user’s phone number.</w:t>
+      </w:r>
+    </w:p>
+    <w:p>
+      <w:pPr>
+        <w:pStyle w:val="ListParagraph"/>
+        <w:ind w:firstLine="0"/>
         <w:rPr>
           <w:sz w:val="20"/>
           <w:szCs w:val="20"/>
@@ -1353,25 +1430,7 @@
           <w:sz w:val="20"/>
           <w:szCs w:val="20"/>
         </w:rPr>
-        <w:t>Place – Novice Champion, LLM Chess Hackathon (</w:t>
-      </w:r>
-      <w:proofErr w:type="spellStart"/>
-      <w:r>
-        <w:rPr>
-          <w:b/>
-          <w:sz w:val="20"/>
-          <w:szCs w:val="20"/>
-        </w:rPr>
-        <w:t>StrongCompute</w:t>
-      </w:r>
-      <w:proofErr w:type="spellEnd"/>
-      <w:r>
-        <w:rPr>
-          <w:b/>
-          <w:sz w:val="20"/>
-          <w:szCs w:val="20"/>
-        </w:rPr>
-        <w:t>)</w:t>
+        <w:t>Place – Novice Champion, LLM Chess Hackathon (StrongCompute)</w:t>
       </w:r>
       <w:r>
         <w:rPr>
@@ -1416,16 +1475,7 @@
           <w:sz w:val="20"/>
           <w:szCs w:val="20"/>
         </w:rPr>
-        <w:t xml:space="preserve">Python, </w:t>
-      </w:r>
-      <w:proofErr w:type="spellStart"/>
-      <w:r>
-        <w:rPr>
-          <w:i/>
-          <w:sz w:val="20"/>
-          <w:szCs w:val="20"/>
-        </w:rPr>
-        <w:t>Py</w:t>
+        <w:t>Python, Py</w:t>
       </w:r>
       <w:r>
         <w:rPr>
@@ -1441,25 +1491,7 @@
           <w:sz w:val="20"/>
           <w:szCs w:val="20"/>
         </w:rPr>
-        <w:t>orch</w:t>
-      </w:r>
-      <w:proofErr w:type="spellEnd"/>
-      <w:r>
-        <w:rPr>
-          <w:i/>
-          <w:sz w:val="20"/>
-          <w:szCs w:val="20"/>
-        </w:rPr>
-        <w:t xml:space="preserve">, </w:t>
-      </w:r>
-      <w:proofErr w:type="spellStart"/>
-      <w:r>
-        <w:rPr>
-          <w:i/>
-          <w:sz w:val="20"/>
-          <w:szCs w:val="20"/>
-        </w:rPr>
-        <w:t>Tensor</w:t>
+        <w:t>orch, Tensor</w:t>
       </w:r>
       <w:r>
         <w:rPr>
@@ -1477,7 +1509,6 @@
         </w:rPr>
         <w:t>oard</w:t>
       </w:r>
-      <w:proofErr w:type="spellEnd"/>
     </w:p>
     <w:p>
       <w:pPr>
@@ -1529,23 +1560,7 @@
           <w:sz w:val="20"/>
           <w:szCs w:val="20"/>
         </w:rPr>
-        <w:t xml:space="preserve">H100s, </w:t>
-      </w:r>
-      <w:proofErr w:type="spellStart"/>
-      <w:r>
-        <w:rPr>
-          <w:sz w:val="20"/>
-          <w:szCs w:val="20"/>
-        </w:rPr>
-        <w:t>FlashAttention</w:t>
-      </w:r>
-      <w:proofErr w:type="spellEnd"/>
-      <w:r>
-        <w:rPr>
-          <w:sz w:val="20"/>
-          <w:szCs w:val="20"/>
-        </w:rPr>
-        <w:t>, FSDP, GELU, and AMP.</w:t>
+        <w:t>H100s, FlashAttention, FSDP, GELU, and AMP.</w:t>
       </w:r>
     </w:p>
     <w:p>
@@ -1572,7 +1587,7 @@
           <w:sz w:val="20"/>
           <w:szCs w:val="20"/>
         </w:rPr>
-        <w:t>Won Novice Champion by having my LLM agent defeat other LLM agents in 1-on-1 chess matches (100-move max).</w:t>
+        <w:t>Won Novice Champion after my LLM agent defeated other LLM agents in one-on-one chess matches with a 100-move limit.</w:t>
       </w:r>
     </w:p>
     <w:p>
@@ -1626,31 +1641,18 @@
         </w:tabs>
         <w:spacing w:before="1" w:line="299" w:lineRule="exact"/>
         <w:rPr>
-          <w:b/>
-          <w:sz w:val="20"/>
-          <w:szCs w:val="20"/>
-        </w:rPr>
-      </w:pPr>
-      <w:r>
-        <w:rPr>
-          <w:sz w:val="20"/>
-          <w:szCs w:val="20"/>
-        </w:rPr>
-        <w:t>Lead designer</w:t>
-      </w:r>
-      <w:r>
-        <w:rPr>
-          <w:sz w:val="20"/>
-          <w:szCs w:val="20"/>
-        </w:rPr>
-        <w:t xml:space="preserve"> and </w:t>
-      </w:r>
-      <w:r>
-        <w:rPr>
-          <w:sz w:val="20"/>
-          <w:szCs w:val="20"/>
-        </w:rPr>
-        <w:t>inventor of a database configuration system that automatically predicts optimal database configurations based on customer workloads using AI reinforcement learning techniques.</w:t>
+          <w:bCs/>
+          <w:sz w:val="20"/>
+          <w:szCs w:val="20"/>
+        </w:rPr>
+      </w:pPr>
+      <w:r>
+        <w:rPr>
+          <w:bCs/>
+          <w:sz w:val="20"/>
+          <w:szCs w:val="20"/>
+        </w:rPr>
+        <w:t>Lead designer and inventor of a database configuration system that uses reinforcement learning to predict optimal configurations based on customer workloads.</w:t>
       </w:r>
     </w:p>
     <w:p>
@@ -1788,53 +1790,121 @@
       </w:pPr>
       <w:r>
         <w:rPr>
-          <w:sz w:val="20"/>
-          <w:szCs w:val="20"/>
-        </w:rPr>
-        <w:t xml:space="preserve">Contributed to an open-source project enabling developers to create and train </w:t>
-      </w:r>
-      <w:r>
-        <w:rPr>
-          <w:sz w:val="20"/>
-          <w:szCs w:val="20"/>
-        </w:rPr>
-        <w:t xml:space="preserve">ML </w:t>
-      </w:r>
-      <w:r>
-        <w:rPr>
-          <w:sz w:val="20"/>
-          <w:szCs w:val="20"/>
-        </w:rPr>
-        <w:t>models.</w:t>
-      </w:r>
-      <w:r>
-        <w:t xml:space="preserve"> </w:t>
-      </w:r>
-      <w:r>
-        <w:pict w14:anchorId="3FB62F2E">
-          <v:shape id="_x0000_s1027" type="#_x0000_t202" alt="" style="position:absolute;left:0;text-align:left;margin-left:22.2pt;margin-top:34.55pt;width:568pt;height:18.4pt;z-index:-15727616;mso-wrap-style:square;mso-wrap-edited:f;mso-width-percent:0;mso-height-percent:0;mso-wrap-distance-left:0;mso-wrap-distance-right:0;mso-position-horizontal-relative:page;mso-position-vertical-relative:text;mso-width-percent:0;mso-height-percent:0;v-text-anchor:top" fillcolor="#ddd" strokecolor="#b1b1b1" strokeweight="1.44pt">
-            <v:textbox style="mso-next-textbox:#_x0000_s1027" inset="0,0,0,0">
-              <w:txbxContent>
-                <w:p>
-                  <w:pPr>
-                    <w:spacing w:before="19"/>
-                    <w:ind w:left="107"/>
-                    <w:rPr>
-                      <w:b/>
-                    </w:rPr>
-                  </w:pPr>
-                  <w:r>
-                    <w:rPr>
-                      <w:b/>
-                    </w:rPr>
-                    <w:t>Skills</w:t>
-                  </w:r>
-                </w:p>
-              </w:txbxContent>
-            </v:textbox>
-            <w10:wrap type="topAndBottom" anchorx="page"/>
-          </v:shape>
-        </w:pict>
+          <w:bCs/>
+          <w:sz w:val="20"/>
+          <w:szCs w:val="20"/>
+        </w:rPr>
+        <w:t>Contributed C++/Python changes to TensorFlow runtime/model-training infrastructure.</w:t>
+      </w:r>
+      <w:r>
+        <w:rPr>
+          <w:noProof/>
+        </w:rPr>
+        <mc:AlternateContent>
+          <mc:Choice Requires="wps">
+            <w:drawing>
+              <wp:anchor distT="0" distB="0" distL="0" distR="0" simplePos="0" relativeHeight="487588864" behindDoc="1" locked="0" layoutInCell="1" allowOverlap="1" wp14:anchorId="3FB62F2E" wp14:editId="7D7FE367">
+                <wp:simplePos x="0" y="0"/>
+                <wp:positionH relativeFrom="page">
+                  <wp:posOffset>281940</wp:posOffset>
+                </wp:positionH>
+                <wp:positionV relativeFrom="paragraph">
+                  <wp:posOffset>438785</wp:posOffset>
+                </wp:positionV>
+                <wp:extent cx="7213600" cy="233680"/>
+                <wp:effectExtent l="0" t="0" r="0" b="0"/>
+                <wp:wrapTopAndBottom/>
+                <wp:docPr id="1775206434" name="Text Box 3"/>
+                <wp:cNvGraphicFramePr>
+                  <a:graphicFrameLocks xmlns:a="http://schemas.openxmlformats.org/drawingml/2006/main"/>
+                </wp:cNvGraphicFramePr>
+                <a:graphic xmlns:a="http://schemas.openxmlformats.org/drawingml/2006/main">
+                  <a:graphicData uri="http://schemas.microsoft.com/office/word/2010/wordprocessingShape">
+                    <wps:wsp>
+                      <wps:cNvSpPr txBox="1">
+                        <a:spLocks noChangeArrowheads="1"/>
+                      </wps:cNvSpPr>
+                      <wps:spPr bwMode="auto">
+                        <a:xfrm>
+                          <a:off x="0" y="0"/>
+                          <a:ext cx="7213600" cy="233680"/>
+                        </a:xfrm>
+                        <a:prstGeom prst="rect">
+                          <a:avLst/>
+                        </a:prstGeom>
+                        <a:solidFill>
+                          <a:srgbClr val="DDDDDD"/>
+                        </a:solidFill>
+                        <a:ln w="18288">
+                          <a:solidFill>
+                            <a:srgbClr val="B1B1B1"/>
+                          </a:solidFill>
+                          <a:miter lim="800000"/>
+                          <a:headEnd/>
+                          <a:tailEnd/>
+                        </a:ln>
+                      </wps:spPr>
+                      <wps:txbx>
+                        <w:txbxContent>
+                          <w:p>
+                            <w:pPr>
+                              <w:spacing w:before="19"/>
+                              <w:ind w:left="107"/>
+                              <w:rPr>
+                                <w:b/>
+                              </w:rPr>
+                            </w:pPr>
+                            <w:r>
+                              <w:rPr>
+                                <w:b/>
+                              </w:rPr>
+                              <w:t>Skills</w:t>
+                            </w:r>
+                          </w:p>
+                        </w:txbxContent>
+                      </wps:txbx>
+                      <wps:bodyPr rot="0" vert="horz" wrap="square" lIns="0" tIns="0" rIns="0" bIns="0" anchor="t" anchorCtr="0" upright="1">
+                        <a:noAutofit/>
+                      </wps:bodyPr>
+                    </wps:wsp>
+                  </a:graphicData>
+                </a:graphic>
+                <wp14:sizeRelH relativeFrom="page">
+                  <wp14:pctWidth>0</wp14:pctWidth>
+                </wp14:sizeRelH>
+                <wp14:sizeRelV relativeFrom="page">
+                  <wp14:pctHeight>0</wp14:pctHeight>
+                </wp14:sizeRelV>
+              </wp:anchor>
+            </w:drawing>
+          </mc:Choice>
+          <mc:Fallback>
+            <w:pict>
+              <v:shape w14:anchorId="3FB62F2E" id="Text Box 3" o:spid="_x0000_s1028" type="#_x0000_t202" style="position:absolute;left:0;text-align:left;margin-left:22.2pt;margin-top:34.55pt;width:568pt;height:18.4pt;z-index:-15727616;visibility:visible;mso-wrap-style:square;mso-width-percent:0;mso-height-percent:0;mso-wrap-distance-left:0;mso-wrap-distance-top:0;mso-wrap-distance-right:0;mso-wrap-distance-bottom:0;mso-position-horizontal:absolute;mso-position-horizontal-relative:page;mso-position-vertical:absolute;mso-position-vertical-relative:text;mso-width-percent:0;mso-height-percent:0;mso-width-relative:page;mso-height-relative:page;v-text-anchor:top" o:gfxdata="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" fillcolor="#ddd" strokecolor="#b1b1b1" strokeweight="1.44pt">
+                <v:textbox inset="0,0,0,0">
+                  <w:txbxContent>
+                    <w:p>
+                      <w:pPr>
+                        <w:spacing w:before="19"/>
+                        <w:ind w:left="107"/>
+                        <w:rPr>
+                          <w:b/>
+                        </w:rPr>
+                      </w:pPr>
+                      <w:r>
+                        <w:rPr>
+                          <w:b/>
+                        </w:rPr>
+                        <w:t>Skills</w:t>
+                      </w:r>
+                    </w:p>
+                  </w:txbxContent>
+                </v:textbox>
+                <w10:wrap type="topAndBottom" anchorx="page"/>
+              </v:shape>
+            </w:pict>
+          </mc:Fallback>
+        </mc:AlternateContent>
       </w:r>
     </w:p>
     <w:p>
@@ -2001,30 +2071,114 @@
         </w:rPr>
       </w:pPr>
       <w:r>
-        <w:pict w14:anchorId="4B3CDC44">
-          <v:shape id="_x0000_s1026" type="#_x0000_t202" alt="" style="position:absolute;margin-left:22.2pt;margin-top:17.45pt;width:568pt;height:18.4pt;z-index:-15727104;mso-wrap-style:square;mso-wrap-edited:f;mso-width-percent:0;mso-height-percent:0;mso-wrap-distance-left:0;mso-wrap-distance-right:0;mso-position-horizontal-relative:page;mso-width-percent:0;mso-height-percent:0;v-text-anchor:top" fillcolor="#ddd" strokecolor="#b1b1b1" strokeweight="1.44pt">
-            <v:textbox style="mso-next-textbox:#_x0000_s1026" inset="0,0,0,0">
-              <w:txbxContent>
-                <w:p>
-                  <w:pPr>
-                    <w:spacing w:before="19"/>
-                    <w:ind w:left="107"/>
-                    <w:rPr>
-                      <w:b/>
-                    </w:rPr>
-                  </w:pPr>
-                  <w:r>
-                    <w:rPr>
-                      <w:b/>
-                    </w:rPr>
-                    <w:t>Education</w:t>
-                  </w:r>
-                </w:p>
-              </w:txbxContent>
-            </v:textbox>
-            <w10:wrap type="topAndBottom" anchorx="page"/>
-          </v:shape>
-        </w:pict>
+        <w:rPr>
+          <w:noProof/>
+        </w:rPr>
+        <mc:AlternateContent>
+          <mc:Choice Requires="wps">
+            <w:drawing>
+              <wp:anchor distT="0" distB="0" distL="0" distR="0" simplePos="0" relativeHeight="487589376" behindDoc="1" locked="0" layoutInCell="1" allowOverlap="1" wp14:anchorId="4B3CDC44" wp14:editId="21522E65">
+                <wp:simplePos x="0" y="0"/>
+                <wp:positionH relativeFrom="page">
+                  <wp:posOffset>281940</wp:posOffset>
+                </wp:positionH>
+                <wp:positionV relativeFrom="paragraph">
+                  <wp:posOffset>221615</wp:posOffset>
+                </wp:positionV>
+                <wp:extent cx="7213600" cy="233680"/>
+                <wp:effectExtent l="0" t="0" r="0" b="0"/>
+                <wp:wrapTopAndBottom/>
+                <wp:docPr id="1739811556" name="Text Box 2"/>
+                <wp:cNvGraphicFramePr>
+                  <a:graphicFrameLocks xmlns:a="http://schemas.openxmlformats.org/drawingml/2006/main"/>
+                </wp:cNvGraphicFramePr>
+                <a:graphic xmlns:a="http://schemas.openxmlformats.org/drawingml/2006/main">
+                  <a:graphicData uri="http://schemas.microsoft.com/office/word/2010/wordprocessingShape">
+                    <wps:wsp>
+                      <wps:cNvSpPr txBox="1">
+                        <a:spLocks noChangeArrowheads="1"/>
+                      </wps:cNvSpPr>
+                      <wps:spPr bwMode="auto">
+                        <a:xfrm>
+                          <a:off x="0" y="0"/>
+                          <a:ext cx="7213600" cy="233680"/>
+                        </a:xfrm>
+                        <a:prstGeom prst="rect">
+                          <a:avLst/>
+                        </a:prstGeom>
+                        <a:solidFill>
+                          <a:srgbClr val="DDDDDD"/>
+                        </a:solidFill>
+                        <a:ln w="18288">
+                          <a:solidFill>
+                            <a:srgbClr val="B1B1B1"/>
+                          </a:solidFill>
+                          <a:miter lim="800000"/>
+                          <a:headEnd/>
+                          <a:tailEnd/>
+                        </a:ln>
+                      </wps:spPr>
+                      <wps:txbx>
+                        <w:txbxContent>
+                          <w:p>
+                            <w:pPr>
+                              <w:spacing w:before="19"/>
+                              <w:ind w:left="107"/>
+                              <w:rPr>
+                                <w:b/>
+                              </w:rPr>
+                            </w:pPr>
+                            <w:r>
+                              <w:rPr>
+                                <w:b/>
+                              </w:rPr>
+                              <w:t>Education</w:t>
+                            </w:r>
+                          </w:p>
+                        </w:txbxContent>
+                      </wps:txbx>
+                      <wps:bodyPr rot="0" vert="horz" wrap="square" lIns="0" tIns="0" rIns="0" bIns="0" anchor="t" anchorCtr="0" upright="1">
+                        <a:noAutofit/>
+                      </wps:bodyPr>
+                    </wps:wsp>
+                  </a:graphicData>
+                </a:graphic>
+                <wp14:sizeRelH relativeFrom="page">
+                  <wp14:pctWidth>0</wp14:pctWidth>
+                </wp14:sizeRelH>
+                <wp14:sizeRelV relativeFrom="page">
+                  <wp14:pctHeight>0</wp14:pctHeight>
+                </wp14:sizeRelV>
+              </wp:anchor>
+            </w:drawing>
+          </mc:Choice>
+          <mc:Fallback>
+            <w:pict>
+              <v:shape w14:anchorId="4B3CDC44" id="Text Box 2" o:spid="_x0000_s1029" type="#_x0000_t202" style="position:absolute;margin-left:22.2pt;margin-top:17.45pt;width:568pt;height:18.4pt;z-index:-15727104;visibility:visible;mso-wrap-style:square;mso-width-percent:0;mso-height-percent:0;mso-wrap-distance-left:0;mso-wrap-distance-top:0;mso-wrap-distance-right:0;mso-wrap-distance-bottom:0;mso-position-horizontal:absolute;mso-position-horizontal-relative:page;mso-position-vertical:absolute;mso-position-vertical-relative:text;mso-width-percent:0;mso-height-percent:0;mso-width-relative:page;mso-height-relative:page;v-text-anchor:top" o:gfxdata="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" fillcolor="#ddd" strokecolor="#b1b1b1" strokeweight="1.44pt">
+                <v:textbox inset="0,0,0,0">
+                  <w:txbxContent>
+                    <w:p>
+                      <w:pPr>
+                        <w:spacing w:before="19"/>
+                        <w:ind w:left="107"/>
+                        <w:rPr>
+                          <w:b/>
+                        </w:rPr>
+                      </w:pPr>
+                      <w:r>
+                        <w:rPr>
+                          <w:b/>
+                        </w:rPr>
+                        <w:t>Education</w:t>
+                      </w:r>
+                    </w:p>
+                  </w:txbxContent>
+                </v:textbox>
+                <w10:wrap type="topAndBottom" anchorx="page"/>
+              </v:shape>
+            </w:pict>
+          </mc:Fallback>
+        </mc:AlternateContent>
       </w:r>
       <w:r>
         <w:rPr>
@@ -2172,49 +2326,15 @@
           <w:sz w:val="20"/>
           <w:szCs w:val="20"/>
         </w:rPr>
-        <w:t>University of Toronto, St.</w:t>
-      </w:r>
-      <w:r>
-        <w:rPr>
-          <w:b/>
-          <w:spacing w:val="-20"/>
-          <w:sz w:val="20"/>
-          <w:szCs w:val="20"/>
-        </w:rPr>
-        <w:t xml:space="preserve"> </w:t>
-      </w:r>
-      <w:r>
-        <w:rPr>
-          <w:b/>
-          <w:sz w:val="20"/>
-          <w:szCs w:val="20"/>
-        </w:rPr>
-        <w:t>George</w:t>
-      </w:r>
-      <w:r>
-        <w:rPr>
-          <w:b/>
-          <w:spacing w:val="-6"/>
-          <w:sz w:val="20"/>
-          <w:szCs w:val="20"/>
-        </w:rPr>
-        <w:t xml:space="preserve"> </w:t>
-      </w:r>
-      <w:r>
-        <w:rPr>
-          <w:b/>
-          <w:sz w:val="20"/>
-          <w:szCs w:val="20"/>
-        </w:rPr>
-        <w:t>Campu</w:t>
-      </w:r>
-      <w:r>
-        <w:rPr>
-          <w:b/>
-          <w:sz w:val="20"/>
-          <w:szCs w:val="20"/>
-        </w:rPr>
-        <w:t xml:space="preserve">s                                                                                            </w:t>
+        <w:t>University of Toronto</w:t>
+      </w:r>
+      <w:r>
+        <w:rPr>
+          <w:b/>
+          <w:sz w:val="20"/>
+          <w:szCs w:val="20"/>
+        </w:rPr>
+        <w:t xml:space="preserve">                                                                                            </w:t>
       </w:r>
       <w:r>
         <w:rPr>

</xml_diff>